<commit_message>
Configure Tauri packaging and create native Windows desktop shortcut for Composer Studio
Made-with: Cursor
</commit_message>
<xml_diff>
--- a/docs/Packaging_Guide.docx
+++ b/docs/Packaging_Guide.docx
@@ -2,7 +2,7 @@
 <file path=word/document.xml><?xml version="1.0" encoding="utf-8"?>
 <w:document xmlns:w="http://schemas.openxmlformats.org/wordprocessingml/2006/main" xmlns:m="http://schemas.openxmlformats.org/officeDocument/2006/math" xmlns:r="http://schemas.openxmlformats.org/officeDocument/2006/relationships" xmlns:o="urn:schemas-microsoft-com:office:office" xmlns:v="urn:schemas-microsoft-com:vml" xmlns:w10="urn:schemas-microsoft-com:office:word" xmlns:a="http://schemas.openxmlformats.org/drawingml/2006/main" xmlns:pic="http://schemas.openxmlformats.org/drawingml/2006/picture" xmlns:wp="http://schemas.openxmlformats.org/drawingml/2006/wordprocessingDrawing">
   <w:body>
-    <w:bookmarkStart w:id="21" w:name="X487f0b6f4f6b2512bd5da96e60373ccba6662b2"/>
+    <w:bookmarkStart w:id="19" w:name="X487f0b6f4f6b2512bd5da96e60373ccba6662b2"/>
     <w:p>
       <w:pPr>
         <w:pStyle w:val="Heading1"/>
@@ -405,7 +405,7 @@
       </w:r>
     </w:p>
     <w:bookmarkEnd w:id="11"/>
-    <w:bookmarkStart w:id="14" w:name="launch-the-packaged-app"/>
+    <w:bookmarkStart w:id="12" w:name="launch-the-packaged-app"/>
     <w:p>
       <w:pPr>
         <w:pStyle w:val="Heading2"/>
@@ -435,53 +435,7 @@
         <w:t xml:space="preserve"> </w:t>
       </w:r>
       <w:r>
-        <w:t xml:space="preserve">to run. Two options:</w:t>
-      </w:r>
-    </w:p>
-    <w:bookmarkStart w:id="12" w:name="option-a-launcher-script-recommended"/>
-    <w:p>
-      <w:pPr>
-        <w:pStyle w:val="Heading3"/>
-      </w:pPr>
-      <w:r>
-        <w:t xml:space="preserve">Option A: Launcher script (recommended)</w:t>
-      </w:r>
-    </w:p>
-    <w:p>
-      <w:pPr>
-        <w:pStyle w:val="FirstParagraph"/>
-      </w:pPr>
-      <w:r>
-        <w:t xml:space="preserve">From the project root:</w:t>
-      </w:r>
-    </w:p>
-    <w:p>
-      <w:pPr>
-        <w:pStyle w:val="SourceCode"/>
-      </w:pPr>
-      <w:r>
-        <w:rPr>
-          <w:rStyle w:val="ExtensionTok"/>
-        </w:rPr>
-        <w:t xml:space="preserve">scripts\launch_desktop.bat</w:t>
-      </w:r>
-    </w:p>
-    <w:p>
-      <w:pPr>
-        <w:pStyle w:val="FirstParagraph"/>
-      </w:pPr>
-      <w:r>
-        <w:t xml:space="preserve">This starts the backend, waits for readiness, then launches the Tauri app.</w:t>
-      </w:r>
-    </w:p>
-    <w:bookmarkEnd w:id="12"/>
-    <w:bookmarkStart w:id="13" w:name="option-b-manual"/>
-    <w:p>
-      <w:pPr>
-        <w:pStyle w:val="Heading3"/>
-      </w:pPr>
-      <w:r>
-        <w:t xml:space="preserve">Option B: Manual</w:t>
+        <w:t xml:space="preserve">to run on port 8765.</w:t>
       </w:r>
     </w:p>
     <w:p>
@@ -524,7 +478,23 @@
         </w:numPr>
       </w:pPr>
       <w:r>
-        <w:t xml:space="preserve">Run the executable:</w:t>
+        <w:t xml:space="preserve">Launch the app via the</w:t>
+      </w:r>
+      <w:r>
+        <w:t xml:space="preserve"> </w:t>
+      </w:r>
+      <w:r>
+        <w:rPr>
+          <w:b/>
+          <w:bCs/>
+        </w:rPr>
+        <w:t xml:space="preserve">desktop shortcut</w:t>
+      </w:r>
+      <w:r>
+        <w:t xml:space="preserve"> </w:t>
+      </w:r>
+      <w:r>
+        <w:t xml:space="preserve">or run:</w:t>
       </w:r>
     </w:p>
     <w:p>
@@ -555,15 +525,129 @@
         </w:pict>
       </w:r>
     </w:p>
+    <w:bookmarkEnd w:id="12"/>
+    <w:bookmarkStart w:id="13" w:name="desktop-shortcut"/>
+    <w:p>
+      <w:pPr>
+        <w:pStyle w:val="Heading2"/>
+      </w:pPr>
+      <w:r>
+        <w:t xml:space="preserve">Desktop Shortcut</w:t>
+      </w:r>
+    </w:p>
+    <w:p>
+      <w:pPr>
+        <w:pStyle w:val="FirstParagraph"/>
+      </w:pPr>
+      <w:r>
+        <w:t xml:space="preserve">A native Windows shortcut is created automatically after a successful build:</w:t>
+      </w:r>
+    </w:p>
+    <w:p>
+      <w:pPr>
+        <w:pStyle w:val="SourceCode"/>
+      </w:pPr>
+      <w:r>
+        <w:rPr>
+          <w:rStyle w:val="ExtensionTok"/>
+        </w:rPr>
+        <w:t xml:space="preserve">npm</w:t>
+      </w:r>
+      <w:r>
+        <w:rPr>
+          <w:rStyle w:val="NormalTok"/>
+        </w:rPr>
+        <w:t xml:space="preserve"> run tauri:build:full</w:t>
+      </w:r>
+    </w:p>
+    <w:p>
+      <w:pPr>
+        <w:pStyle w:val="FirstParagraph"/>
+      </w:pPr>
+      <w:r>
+        <w:t xml:space="preserve">Or create the shortcut manually after building:</w:t>
+      </w:r>
+    </w:p>
+    <w:p>
+      <w:pPr>
+        <w:pStyle w:val="SourceCode"/>
+      </w:pPr>
+      <w:r>
+        <w:rPr>
+          <w:rStyle w:val="ExtensionTok"/>
+        </w:rPr>
+        <w:t xml:space="preserve">npm</w:t>
+      </w:r>
+      <w:r>
+        <w:rPr>
+          <w:rStyle w:val="NormalTok"/>
+        </w:rPr>
+        <w:t xml:space="preserve"> run create-shortcut</w:t>
+      </w:r>
+    </w:p>
+    <w:p>
+      <w:pPr>
+        <w:pStyle w:val="FirstParagraph"/>
+      </w:pPr>
+      <w:r>
+        <w:t xml:space="preserve">The shortcut appears on your Desktop as</w:t>
+      </w:r>
+      <w:r>
+        <w:t xml:space="preserve"> </w:t>
+      </w:r>
+      <w:r>
+        <w:rPr>
+          <w:b/>
+          <w:bCs/>
+        </w:rPr>
+        <w:t xml:space="preserve">Composer Studio</w:t>
+      </w:r>
+      <w:r>
+        <w:t xml:space="preserve"> </w:t>
+      </w:r>
+      <w:r>
+        <w:t xml:space="preserve">and points directly to the packaged executable. No .bat files or Python scripts are used for launching.</w:t>
+      </w:r>
+    </w:p>
+    <w:p>
+      <w:r>
+        <w:pict>
+          <v:rect style="width:0;height:1.5pt" o:hralign="center" o:hrstd="t" o:hr="t"/>
+        </w:pict>
+      </w:r>
+    </w:p>
     <w:bookmarkEnd w:id="13"/>
-    <w:bookmarkEnd w:id="14"/>
-    <w:bookmarkStart w:id="15" w:name="desktop-shortcut"/>
+    <w:bookmarkStart w:id="14" w:name="creative-engines-setup"/>
     <w:p>
       <w:pPr>
         <w:pStyle w:val="Heading2"/>
       </w:pPr>
       <w:r>
-        <w:t xml:space="preserve">Desktop Shortcut</w:t>
+        <w:t xml:space="preserve">creative-engines Setup</w:t>
+      </w:r>
+    </w:p>
+    <w:p>
+      <w:pPr>
+        <w:pStyle w:val="FirstParagraph"/>
+      </w:pPr>
+      <w:r>
+        <w:t xml:space="preserve">Composer Studio needs the</w:t>
+      </w:r>
+      <w:r>
+        <w:t xml:space="preserve"> </w:t>
+      </w:r>
+      <w:r>
+        <w:rPr>
+          <w:b/>
+          <w:bCs/>
+        </w:rPr>
+        <w:t xml:space="preserve">creative-engines</w:t>
+      </w:r>
+      <w:r>
+        <w:t xml:space="preserve"> </w:t>
+      </w:r>
+      <w:r>
+        <w:t xml:space="preserve">repository locally:</w:t>
       </w:r>
     </w:p>
     <w:p>
@@ -575,7 +659,11 @@
         </w:numPr>
       </w:pPr>
       <w:r>
-        <w:t xml:space="preserve">Right-click</w:t>
+        <w:rPr>
+          <w:b/>
+          <w:bCs/>
+        </w:rPr>
+        <w:t xml:space="preserve">Default path:</w:t>
       </w:r>
       <w:r>
         <w:t xml:space="preserve"> </w:t>
@@ -584,13 +672,7 @@
         <w:rPr>
           <w:rStyle w:val="VerbatimChar"/>
         </w:rPr>
-        <w:t xml:space="preserve">Composer Studio.exe</w:t>
-      </w:r>
-      <w:r>
-        <w:t xml:space="preserve"> </w:t>
-      </w:r>
-      <w:r>
-        <w:t xml:space="preserve">(or the launcher script)</w:t>
+        <w:t xml:space="preserve">C:\Users\&lt;you&gt;\Documents\Cursor AI Projects\creative-engines</w:t>
       </w:r>
     </w:p>
     <w:p>
@@ -606,67 +688,28 @@
           <w:b/>
           <w:bCs/>
         </w:rPr>
-        <w:t xml:space="preserve">Send to</w:t>
-      </w:r>
-      <w:r>
-        <w:t xml:space="preserve"> </w:t>
-      </w:r>
-      <w:r>
-        <w:t xml:space="preserve">→</w:t>
-      </w:r>
-      <w:r>
-        <w:t xml:space="preserve"> </w:t>
-      </w:r>
-      <w:r>
-        <w:rPr>
-          <w:b/>
-          <w:bCs/>
-        </w:rPr>
-        <w:t xml:space="preserve">Desktop (create shortcut)</w:t>
-      </w:r>
-    </w:p>
-    <w:p>
-      <w:pPr>
-        <w:pStyle w:val="Compact"/>
-        <w:numPr>
-          <w:ilvl w:val="0"/>
-          <w:numId w:val="1005"/>
-        </w:numPr>
-      </w:pPr>
-      <w:r>
-        <w:t xml:space="preserve">For the launcher: right-click the shortcut →</w:t>
-      </w:r>
-      <w:r>
-        <w:t xml:space="preserve"> </w:t>
-      </w:r>
-      <w:r>
-        <w:rPr>
-          <w:b/>
-          <w:bCs/>
-        </w:rPr>
-        <w:t xml:space="preserve">Properties</w:t>
-      </w:r>
-      <w:r>
-        <w:t xml:space="preserve"> </w:t>
-      </w:r>
-      <w:r>
-        <w:t xml:space="preserve">→ set</w:t>
-      </w:r>
-      <w:r>
-        <w:t xml:space="preserve"> </w:t>
-      </w:r>
-      <w:r>
-        <w:rPr>
-          <w:b/>
-          <w:bCs/>
-        </w:rPr>
-        <w:t xml:space="preserve">Start in</w:t>
-      </w:r>
-      <w:r>
-        <w:t xml:space="preserve"> </w:t>
-      </w:r>
-      <w:r>
-        <w:t xml:space="preserve">to the project root so the backend path resolves correctly</w:t>
+        <w:t xml:space="preserve">Override:</w:t>
+      </w:r>
+      <w:r>
+        <w:t xml:space="preserve"> </w:t>
+      </w:r>
+      <w:r>
+        <w:t xml:space="preserve">set</w:t>
+      </w:r>
+      <w:r>
+        <w:t xml:space="preserve"> </w:t>
+      </w:r>
+      <w:r>
+        <w:rPr>
+          <w:rStyle w:val="VerbatimChar"/>
+        </w:rPr>
+        <w:t xml:space="preserve">CREATIVE_ENGINES_PATH</w:t>
+      </w:r>
+      <w:r>
+        <w:t xml:space="preserve"> </w:t>
+      </w:r>
+      <w:r>
+        <w:t xml:space="preserve">to your path before starting the backend</w:t>
       </w:r>
     </w:p>
     <w:p>
@@ -676,38 +719,14 @@
         </w:pict>
       </w:r>
     </w:p>
-    <w:bookmarkEnd w:id="15"/>
-    <w:bookmarkStart w:id="16" w:name="creative-engines-setup"/>
+    <w:bookmarkEnd w:id="14"/>
+    <w:bookmarkStart w:id="15" w:name="verify-the-packaged-app"/>
     <w:p>
       <w:pPr>
         <w:pStyle w:val="Heading2"/>
       </w:pPr>
       <w:r>
-        <w:t xml:space="preserve">creative-engines Setup</w:t>
-      </w:r>
-    </w:p>
-    <w:p>
-      <w:pPr>
-        <w:pStyle w:val="FirstParagraph"/>
-      </w:pPr>
-      <w:r>
-        <w:t xml:space="preserve">Composer Studio needs the</w:t>
-      </w:r>
-      <w:r>
-        <w:t xml:space="preserve"> </w:t>
-      </w:r>
-      <w:r>
-        <w:rPr>
-          <w:b/>
-          <w:bCs/>
-        </w:rPr>
-        <w:t xml:space="preserve">creative-engines</w:t>
-      </w:r>
-      <w:r>
-        <w:t xml:space="preserve"> </w:t>
-      </w:r>
-      <w:r>
-        <w:t xml:space="preserve">repository locally:</w:t>
+        <w:t xml:space="preserve">Verify the Packaged App</w:t>
       </w:r>
     </w:p>
     <w:p>
@@ -719,20 +738,7 @@
         </w:numPr>
       </w:pPr>
       <w:r>
-        <w:rPr>
-          <w:b/>
-          <w:bCs/>
-        </w:rPr>
-        <w:t xml:space="preserve">Default path:</w:t>
-      </w:r>
-      <w:r>
-        <w:t xml:space="preserve"> </w:t>
-      </w:r>
-      <w:r>
-        <w:rPr>
-          <w:rStyle w:val="VerbatimChar"/>
-        </w:rPr>
-        <w:t xml:space="preserve">C:\Users\&lt;you&gt;\Documents\Cursor AI Projects\creative-engines</w:t>
+        <w:t xml:space="preserve">Launch the app (via launcher or manually)</w:t>
       </w:r>
     </w:p>
     <w:p>
@@ -744,17 +750,19 @@
         </w:numPr>
       </w:pPr>
       <w:r>
-        <w:rPr>
-          <w:b/>
-          <w:bCs/>
-        </w:rPr>
-        <w:t xml:space="preserve">Override:</w:t>
-      </w:r>
-      <w:r>
-        <w:t xml:space="preserve"> </w:t>
-      </w:r>
-      <w:r>
-        <w:t xml:space="preserve">set</w:t>
+        <w:t xml:space="preserve">Confirm engines load (Preset dropdown or Hybrid view)</w:t>
+      </w:r>
+    </w:p>
+    <w:p>
+      <w:pPr>
+        <w:pStyle w:val="Compact"/>
+        <w:numPr>
+          <w:ilvl w:val="0"/>
+          <w:numId w:val="1006"/>
+        </w:numPr>
+      </w:pPr>
+      <w:r>
+        <w:t xml:space="preserve">Generate one piece (e.g. preset</w:t>
       </w:r>
       <w:r>
         <w:t xml:space="preserve"> </w:t>
@@ -763,13 +771,43 @@
         <w:rPr>
           <w:rStyle w:val="VerbatimChar"/>
         </w:rPr>
-        <w:t xml:space="preserve">CREATIVE_ENGINES_PATH</w:t>
-      </w:r>
-      <w:r>
-        <w:t xml:space="preserve"> </w:t>
-      </w:r>
-      <w:r>
-        <w:t xml:space="preserve">to your path before starting the backend</w:t>
+        <w:t xml:space="preserve">wheeler_lyric</w:t>
+      </w:r>
+      <w:r>
+        <w:t xml:space="preserve">, input</w:t>
+      </w:r>
+      <w:r>
+        <w:t xml:space="preserve"> </w:t>
+      </w:r>
+      <w:r>
+        <w:t xml:space="preserve">“test”</w:t>
+      </w:r>
+      <w:r>
+        <w:t xml:space="preserve">)</w:t>
+      </w:r>
+    </w:p>
+    <w:p>
+      <w:pPr>
+        <w:pStyle w:val="Compact"/>
+        <w:numPr>
+          <w:ilvl w:val="0"/>
+          <w:numId w:val="1006"/>
+        </w:numPr>
+      </w:pPr>
+      <w:r>
+        <w:t xml:space="preserve">View notation in the score viewer</w:t>
+      </w:r>
+    </w:p>
+    <w:p>
+      <w:pPr>
+        <w:pStyle w:val="Compact"/>
+        <w:numPr>
+          <w:ilvl w:val="0"/>
+          <w:numId w:val="1006"/>
+        </w:numPr>
+      </w:pPr>
+      <w:r>
+        <w:t xml:space="preserve">Export one MusicXML file</w:t>
       </w:r>
     </w:p>
     <w:p>
@@ -779,95 +817,39 @@
         </w:pict>
       </w:r>
     </w:p>
-    <w:bookmarkEnd w:id="16"/>
-    <w:bookmarkStart w:id="17" w:name="verify-the-packaged-app"/>
+    <w:bookmarkEnd w:id="15"/>
+    <w:bookmarkStart w:id="16" w:name="development-mode"/>
     <w:p>
       <w:pPr>
         <w:pStyle w:val="Heading2"/>
       </w:pPr>
       <w:r>
-        <w:t xml:space="preserve">Verify the Packaged App</w:t>
-      </w:r>
-    </w:p>
-    <w:p>
-      <w:pPr>
-        <w:pStyle w:val="Compact"/>
-        <w:numPr>
-          <w:ilvl w:val="0"/>
-          <w:numId w:val="1007"/>
-        </w:numPr>
-      </w:pPr>
-      <w:r>
-        <w:t xml:space="preserve">Launch the app (via launcher or manually)</w:t>
-      </w:r>
-    </w:p>
-    <w:p>
-      <w:pPr>
-        <w:pStyle w:val="Compact"/>
-        <w:numPr>
-          <w:ilvl w:val="0"/>
-          <w:numId w:val="1007"/>
-        </w:numPr>
-      </w:pPr>
-      <w:r>
-        <w:t xml:space="preserve">Confirm engines load (Preset dropdown or Hybrid view)</w:t>
-      </w:r>
-    </w:p>
-    <w:p>
-      <w:pPr>
-        <w:pStyle w:val="Compact"/>
-        <w:numPr>
-          <w:ilvl w:val="0"/>
-          <w:numId w:val="1007"/>
-        </w:numPr>
-      </w:pPr>
-      <w:r>
-        <w:t xml:space="preserve">Generate one piece (e.g. preset</w:t>
-      </w:r>
-      <w:r>
-        <w:t xml:space="preserve"> </w:t>
-      </w:r>
-      <w:r>
-        <w:rPr>
-          <w:rStyle w:val="VerbatimChar"/>
-        </w:rPr>
-        <w:t xml:space="preserve">wheeler_lyric</w:t>
-      </w:r>
-      <w:r>
-        <w:t xml:space="preserve">, input</w:t>
-      </w:r>
-      <w:r>
-        <w:t xml:space="preserve"> </w:t>
-      </w:r>
-      <w:r>
-        <w:t xml:space="preserve">“test”</w:t>
-      </w:r>
-      <w:r>
-        <w:t xml:space="preserve">)</w:t>
-      </w:r>
-    </w:p>
-    <w:p>
-      <w:pPr>
-        <w:pStyle w:val="Compact"/>
-        <w:numPr>
-          <w:ilvl w:val="0"/>
-          <w:numId w:val="1007"/>
-        </w:numPr>
-      </w:pPr>
-      <w:r>
-        <w:t xml:space="preserve">View notation in the score viewer</w:t>
-      </w:r>
-    </w:p>
-    <w:p>
-      <w:pPr>
-        <w:pStyle w:val="Compact"/>
-        <w:numPr>
-          <w:ilvl w:val="0"/>
-          <w:numId w:val="1007"/>
-        </w:numPr>
-      </w:pPr>
-      <w:r>
-        <w:t xml:space="preserve">Export one MusicXML file</w:t>
+        <w:t xml:space="preserve">Development Mode</w:t>
+      </w:r>
+    </w:p>
+    <w:p>
+      <w:pPr>
+        <w:pStyle w:val="FirstParagraph"/>
+      </w:pPr>
+      <w:r>
+        <w:t xml:space="preserve">Single-command dev (backend + frontend + Tauri window):</w:t>
+      </w:r>
+    </w:p>
+    <w:p>
+      <w:pPr>
+        <w:pStyle w:val="SourceCode"/>
+      </w:pPr>
+      <w:r>
+        <w:rPr>
+          <w:rStyle w:val="ExtensionTok"/>
+        </w:rPr>
+        <w:t xml:space="preserve">npm</w:t>
+      </w:r>
+      <w:r>
+        <w:rPr>
+          <w:rStyle w:val="NormalTok"/>
+        </w:rPr>
+        <w:t xml:space="preserve"> run tauri:dev</w:t>
       </w:r>
     </w:p>
     <w:p>
@@ -877,50 +859,8 @@
         </w:pict>
       </w:r>
     </w:p>
-    <w:bookmarkEnd w:id="17"/>
-    <w:bookmarkStart w:id="18" w:name="development-mode"/>
-    <w:p>
-      <w:pPr>
-        <w:pStyle w:val="Heading2"/>
-      </w:pPr>
-      <w:r>
-        <w:t xml:space="preserve">Development Mode</w:t>
-      </w:r>
-    </w:p>
-    <w:p>
-      <w:pPr>
-        <w:pStyle w:val="FirstParagraph"/>
-      </w:pPr>
-      <w:r>
-        <w:t xml:space="preserve">Single-command dev (backend + frontend + Tauri window):</w:t>
-      </w:r>
-    </w:p>
-    <w:p>
-      <w:pPr>
-        <w:pStyle w:val="SourceCode"/>
-      </w:pPr>
-      <w:r>
-        <w:rPr>
-          <w:rStyle w:val="ExtensionTok"/>
-        </w:rPr>
-        <w:t xml:space="preserve">npm</w:t>
-      </w:r>
-      <w:r>
-        <w:rPr>
-          <w:rStyle w:val="NormalTok"/>
-        </w:rPr>
-        <w:t xml:space="preserve"> run tauri:dev</w:t>
-      </w:r>
-    </w:p>
-    <w:p>
-      <w:r>
-        <w:pict>
-          <v:rect style="width:0;height:1.5pt" o:hralign="center" o:hrstd="t" o:hr="t"/>
-        </w:pict>
-      </w:r>
-    </w:p>
-    <w:bookmarkEnd w:id="18"/>
-    <w:bookmarkStart w:id="19" w:name="configuration-summary"/>
+    <w:bookmarkEnd w:id="16"/>
+    <w:bookmarkStart w:id="17" w:name="configuration-summary"/>
     <w:p>
       <w:pPr>
         <w:pStyle w:val="Heading2"/>
@@ -1100,8 +1040,8 @@
         </w:pict>
       </w:r>
     </w:p>
-    <w:bookmarkEnd w:id="19"/>
-    <w:bookmarkStart w:id="20" w:name="troubleshooting"/>
+    <w:bookmarkEnd w:id="17"/>
+    <w:bookmarkStart w:id="18" w:name="troubleshooting"/>
     <w:p>
       <w:pPr>
         <w:pStyle w:val="Heading2"/>
@@ -1115,7 +1055,7 @@
         <w:pStyle w:val="Compact"/>
         <w:numPr>
           <w:ilvl w:val="0"/>
-          <w:numId w:val="1008"/>
+          <w:numId w:val="1007"/>
         </w:numPr>
       </w:pPr>
       <w:r>
@@ -1148,7 +1088,7 @@
         <w:pStyle w:val="Compact"/>
         <w:numPr>
           <w:ilvl w:val="0"/>
-          <w:numId w:val="1008"/>
+          <w:numId w:val="1007"/>
         </w:numPr>
       </w:pPr>
       <w:r>
@@ -1170,7 +1110,7 @@
         <w:pStyle w:val="Compact"/>
         <w:numPr>
           <w:ilvl w:val="0"/>
-          <w:numId w:val="1008"/>
+          <w:numId w:val="1007"/>
         </w:numPr>
       </w:pPr>
       <w:r>
@@ -1202,8 +1142,8 @@
         <w:t xml:space="preserve">and ensure creative-engines is cloned and built</w:t>
       </w:r>
     </w:p>
-    <w:bookmarkEnd w:id="20"/>
-    <w:bookmarkEnd w:id="21"/>
+    <w:bookmarkEnd w:id="18"/>
+    <w:bookmarkEnd w:id="19"/>
     <w:sectPr>
       <w:footnotePr>
         <w:numRestart w:val="eachSect"/>
@@ -1572,6 +1512,9 @@
     </w:lvlOverride>
   </w:num>
   <w:num w:numId="1005">
+    <w:abstractNumId w:val="991"/>
+  </w:num>
+  <w:num w:numId="1006">
     <w:abstractNumId w:val="99411"/>
     <w:lvlOverride w:ilvl="0">
       <w:startOverride w:val="1"/>
@@ -1601,40 +1544,7 @@
       <w:startOverride w:val="1"/>
     </w:lvlOverride>
   </w:num>
-  <w:num w:numId="1006">
-    <w:abstractNumId w:val="991"/>
-  </w:num>
   <w:num w:numId="1007">
-    <w:abstractNumId w:val="99411"/>
-    <w:lvlOverride w:ilvl="0">
-      <w:startOverride w:val="1"/>
-    </w:lvlOverride>
-    <w:lvlOverride w:ilvl="1">
-      <w:startOverride w:val="1"/>
-    </w:lvlOverride>
-    <w:lvlOverride w:ilvl="2">
-      <w:startOverride w:val="1"/>
-    </w:lvlOverride>
-    <w:lvlOverride w:ilvl="3">
-      <w:startOverride w:val="1"/>
-    </w:lvlOverride>
-    <w:lvlOverride w:ilvl="4">
-      <w:startOverride w:val="1"/>
-    </w:lvlOverride>
-    <w:lvlOverride w:ilvl="5">
-      <w:startOverride w:val="1"/>
-    </w:lvlOverride>
-    <w:lvlOverride w:ilvl="6">
-      <w:startOverride w:val="1"/>
-    </w:lvlOverride>
-    <w:lvlOverride w:ilvl="7">
-      <w:startOverride w:val="1"/>
-    </w:lvlOverride>
-    <w:lvlOverride w:ilvl="8">
-      <w:startOverride w:val="1"/>
-    </w:lvlOverride>
-  </w:num>
-  <w:num w:numId="1008">
     <w:abstractNumId w:val="991"/>
   </w:num>
 </w:numbering>

</xml_diff>